<commit_message>
Jarduera: domeinu librea, entrega eta galderatxoak
Ikasleek hasieratik domeinu propioa aukeratu, whois/nslookup/dig
erabili, emaitzak dokumentuan entregatu, eta tresnen galderak erantzun.

Co-authored-by: jazkune-izarraitz <jazkune-izarraitz@users.noreply.github.com>
</commit_message>
<xml_diff>
--- a/testak/Ezagutze_pasiboa_jarduera_praktikoa.docx
+++ b/testak/Ezagutze_pasiboa_jarduera_praktikoa.docx
@@ -19,14 +19,123 @@
         <w:rPr>
           <w:i/>
         </w:rPr>
-        <w:t>Tresnak: whois · nslookup · dig</w:t>
+        <w:t>whois · nslookup · dig</w:t>
         <w:br/>
-        <w:t>Helburua: domeinu publikoen informazioa bildu, helburua zuzenean erasotu gabe</w:t>
+        <w:t>Ikasleak aukeratutako domeinu batekin</w:t>
+      </w:r>
+    </w:p>
+    <w:p>
+      <w:pPr>
+        <w:pStyle w:val="Heading1"/>
+      </w:pPr>
+      <w:r>
+        <w:t>Helburua</w:t>
       </w:r>
     </w:p>
     <w:p>
       <w:r>
-        <w:t>Lan egin Linux terminalean (Kali, AttackBox, Ubuntu…). Komandoak zuk exekutatu behar dituzu. Erantzunak idatzi lerroetan. Irtenbideak dokumentuko azken orrialdean daude.</w:t>
+        <w:t>Domeinu publiko bat aukeratu eta ezagutze pasiboa egin whois, nslookup eta dig tresnekin. Amaieran, zure bilaketen emaitzak dokumentu batean entregatu.</w:t>
+      </w:r>
+    </w:p>
+    <w:p>
+      <w:pPr>
+        <w:pStyle w:val="Heading1"/>
+      </w:pPr>
+      <w:r>
+        <w:t>Entrega</w:t>
+      </w:r>
+    </w:p>
+    <w:p>
+      <w:r>
+        <w:t>Entregatu Word edo PDF dokumentu bat (izenburua adibidez: Ezagutze_pasiboa_IzenaAbizena), honakoekin:</w:t>
+      </w:r>
+    </w:p>
+    <w:p>
+      <w:pPr>
+        <w:pStyle w:val="ListNumber"/>
+      </w:pPr>
+      <w:r>
+        <w:t>Aukeratutako domeinua eta zergatik aukeratu duzun (1–2 esaldi).</w:t>
+      </w:r>
+    </w:p>
+    <w:p>
+      <w:pPr>
+        <w:pStyle w:val="ListNumber"/>
+      </w:pPr>
+      <w:r>
+        <w:t>Exekutatutako komando bakoitza (kopiatu-itsatsi).</w:t>
+      </w:r>
+    </w:p>
+    <w:p>
+      <w:pPr>
+        <w:pStyle w:val="ListNumber"/>
+      </w:pPr>
+      <w:r>
+        <w:t>Komando bakoitzaren irteeraren zati garrantzitsua (ez derrigorrez dena).</w:t>
+      </w:r>
+    </w:p>
+    <w:p>
+      <w:pPr>
+        <w:pStyle w:val="ListNumber"/>
+      </w:pPr>
+      <w:r>
+        <w:t>Beheko galderen erantzunak.</w:t>
+      </w:r>
+    </w:p>
+    <w:p>
+      <w:pPr>
+        <w:pStyle w:val="ListNumber"/>
+      </w:pPr>
+      <w:r>
+        <w:t>Ondorio labur bat (zer ikasi duzun / zer aurkitu duzun).</w:t>
+      </w:r>
+    </w:p>
+    <w:p>
+      <w:pPr>
+        <w:pStyle w:val="Heading1"/>
+      </w:pPr>
+      <w:r>
+        <w:t>Arauak</w:t>
+      </w:r>
+    </w:p>
+    <w:p>
+      <w:pPr>
+        <w:pStyle w:val="ListBullet"/>
+      </w:pPr>
+      <w:r>
+        <w:t>Domeinu LIBREA aukeratu hasieratik (webgune, enpresa, eskola, proiektu…).</w:t>
+      </w:r>
+    </w:p>
+    <w:p>
+      <w:pPr>
+        <w:pStyle w:val="ListBullet"/>
+      </w:pPr>
+      <w:r>
+        <w:t>Ez erabili TryHackMe-ko adibide finkoak (tryhackme.com, thmlabs.com) lanaren oinarri gisa.</w:t>
+      </w:r>
+    </w:p>
+    <w:p>
+      <w:pPr>
+        <w:pStyle w:val="ListBullet"/>
+      </w:pPr>
+      <w:r>
+        <w:t>Soilik kontsulta pasiboak: whois, nslookup, dig. Ez ping, ez nmap, ez eskaneorik.</w:t>
+      </w:r>
+    </w:p>
+    <w:p>
+      <w:pPr>
+        <w:pStyle w:val="ListBullet"/>
+      </w:pPr>
+      <w:r>
+        <w:t>Errespetatu pribatutasuna: ez bilatu datu pertsonal sentikorrak entregatzeko.</w:t>
+      </w:r>
+    </w:p>
+    <w:p>
+      <w:pPr>
+        <w:pStyle w:val="ListBullet"/>
+      </w:pPr>
+      <w:r>
+        <w:t>Taldean egiten bada, adierazi kideak dokumentuan.</w:t>
       </w:r>
     </w:p>
     <w:p>
@@ -39,7 +148,7 @@
     </w:p>
     <w:p>
       <w:r>
-        <w:t>Egiaztatu tresnak instalatuta daudela:</w:t>
+        <w:t>Tresnak egiaztatu:</w:t>
       </w:r>
     </w:p>
     <w:p>
@@ -63,7 +172,44 @@
     </w:p>
     <w:p>
       <w:r>
-        <w:t>Oharra: kontsulta hauek iturri publikoetara doaz (WHOIS/DNS). Ezagutze pasiboa da; ez bidali paketerik helburuko zerbitzarira (ez ping, ez nmap).</w:t>
+        <w:t>Aukeratu zure DOMEINUA (adib. wikipedia.org, cloudflare.com, zure herriko udalaren webgunea…). Ordezkatu DOMEINUA zure aukerarekin hurrengo komando guztietan.</w:t>
+      </w:r>
+    </w:p>
+    <w:p>
+      <w:r>
+        <w:rPr>
+          <w:b/>
+        </w:rPr>
+        <w:t xml:space="preserve">0.1. </w:t>
+      </w:r>
+      <w:r>
+        <w:t>Zure domeinua:</w:t>
+      </w:r>
+    </w:p>
+    <w:p>
+      <w:r>
+        <w:t>_______________________________________________</w:t>
+      </w:r>
+    </w:p>
+    <w:p>
+      <w:r>
+        <w:rPr>
+          <w:b/>
+        </w:rPr>
+        <w:t xml:space="preserve">0.2. </w:t>
+      </w:r>
+      <w:r>
+        <w:t>Zergatik aukeratu duzu? (1–2 esaldi)</w:t>
+      </w:r>
+    </w:p>
+    <w:p>
+      <w:r>
+        <w:t>_______________________________________________</w:t>
+      </w:r>
+    </w:p>
+    <w:p>
+      <w:r>
+        <w:t>_______________________________________________</w:t>
       </w:r>
     </w:p>
     <w:p>
@@ -71,17 +217,17 @@
         <w:pStyle w:val="Heading1"/>
       </w:pPr>
       <w:r>
-        <w:t>1. atala – whois</w:t>
+        <w:t>1. whois</w:t>
       </w:r>
     </w:p>
     <w:p>
       <w:r>
-        <w:t>WHOIS-ek domeinuaren erregistro-datuak ematen ditu: erregistratzailea, datak, name-zerbitzariak…</w:t>
+        <w:t>WHOIS-ek domeinuaren erregistro-datu publikoak ematen ditu (erregistratzailea, datak, name-zerbitzariak…).</w:t>
       </w:r>
     </w:p>
     <w:p>
       <w:r>
-        <w:t>Exekutatu:</w:t>
+        <w:t>Exekutatu eta gorde irteera (edo zati garrantzitsua):</w:t>
       </w:r>
     </w:p>
     <w:p>
@@ -96,380 +242,12 @@
           <w:color w:val="1A1A1A"/>
           <w:sz w:val="18"/>
         </w:rPr>
-        <w:t>whois tryhackme.com</w:t>
+        <w:t>whois DOMEINUA</w:t>
       </w:r>
     </w:p>
     <w:p>
       <w:r>
-        <w:rPr>
-          <w:b/>
-        </w:rPr>
-        <w:t xml:space="preserve">1.1 </w:t>
-      </w:r>
-      <w:r>
-        <w:t>Noiz erregistratu zen tryhackme.com? (Creation Date)</w:t>
-      </w:r>
-    </w:p>
-    <w:p>
-      <w:r>
-        <w:t>Erantzuna: _________________________________</w:t>
-      </w:r>
-    </w:p>
-    <w:p>
-      <w:r>
-        <w:rPr>
-          <w:b/>
-        </w:rPr>
-        <w:t xml:space="preserve">1.2 </w:t>
-      </w:r>
-      <w:r>
-        <w:t>Zein da erregistratzailea (Registrar)?</w:t>
-      </w:r>
-    </w:p>
-    <w:p>
-      <w:r>
-        <w:t>Erantzuna: _________________________________</w:t>
-      </w:r>
-    </w:p>
-    <w:p>
-      <w:r>
-        <w:rPr>
-          <w:b/>
-        </w:rPr>
-        <w:t xml:space="preserve">1.3 </w:t>
-      </w:r>
-      <w:r>
-        <w:t>Zein enpresaren name-zerbitzariak erabiltzen ditu?</w:t>
-      </w:r>
-    </w:p>
-    <w:p>
-      <w:r>
-        <w:t>Erantzuna: _________________________________</w:t>
-      </w:r>
-    </w:p>
-    <w:p>
-      <w:r>
-        <w:t>Beste domeinu batekin proba (aukerakoa):</w:t>
-      </w:r>
-    </w:p>
-    <w:p>
-      <w:pPr>
-        <w:spacing w:before="80" w:after="80"/>
-        <w:ind w:left="142"/>
-        <w:shd w:val="clear" w:color="auto" w:fill="F0F0F0"/>
-      </w:pPr>
-      <w:r>
-        <w:rPr>
-          <w:rFonts w:ascii="Consolas" w:hAnsi="Consolas" w:eastAsia="Consolas"/>
-          <w:color w:val="1A1A1A"/>
-          <w:sz w:val="18"/>
-        </w:rPr>
-        <w:t>whois wikipedia.org | head -n 40</w:t>
-      </w:r>
-    </w:p>
-    <w:p>
-      <w:pPr>
-        <w:pStyle w:val="Heading1"/>
-      </w:pPr>
-      <w:r>
-        <w:t>2. atala – nslookup</w:t>
-      </w:r>
-    </w:p>
-    <w:p>
-      <w:r>
-        <w:t>nslookup-ek DNS erregistroak kontsultatzen ditu. Erabilgarria da Windows-en eta dokumentazio zaharrean.</w:t>
-      </w:r>
-    </w:p>
-    <w:p>
-      <w:r>
-        <w:t>A erregistroa (IPv4):</w:t>
-      </w:r>
-    </w:p>
-    <w:p>
-      <w:pPr>
-        <w:spacing w:before="80" w:after="80"/>
-        <w:ind w:left="142"/>
-        <w:shd w:val="clear" w:color="auto" w:fill="F0F0F0"/>
-      </w:pPr>
-      <w:r>
-        <w:rPr>
-          <w:rFonts w:ascii="Consolas" w:hAnsi="Consolas" w:eastAsia="Consolas"/>
-          <w:color w:val="1A1A1A"/>
-          <w:sz w:val="18"/>
-        </w:rPr>
-        <w:t>nslookup tryhackme.com</w:t>
-      </w:r>
-    </w:p>
-    <w:p>
-      <w:r>
-        <w:rPr>
-          <w:b/>
-        </w:rPr>
-        <w:t xml:space="preserve">2.1 </w:t>
-      </w:r>
-      <w:r>
-        <w:t>Zein IPv4 helbide (gutxienez bat) lortu duzu?</w:t>
-      </w:r>
-    </w:p>
-    <w:p>
-      <w:r>
-        <w:t>Erantzuna: _________________________________</w:t>
-      </w:r>
-    </w:p>
-    <w:p>
-      <w:r>
-        <w:t>TXT erregistroak:</w:t>
-      </w:r>
-    </w:p>
-    <w:p>
-      <w:pPr>
-        <w:spacing w:before="80" w:after="80"/>
-        <w:ind w:left="142"/>
-        <w:shd w:val="clear" w:color="auto" w:fill="F0F0F0"/>
-      </w:pPr>
-      <w:r>
-        <w:rPr>
-          <w:rFonts w:ascii="Consolas" w:hAnsi="Consolas" w:eastAsia="Consolas"/>
-          <w:color w:val="1A1A1A"/>
-          <w:sz w:val="18"/>
-        </w:rPr>
-        <w:t>nslookup -type=TXT thmlabs.com</w:t>
-      </w:r>
-    </w:p>
-    <w:p>
-      <w:r>
-        <w:rPr>
-          <w:b/>
-        </w:rPr>
-        <w:t xml:space="preserve">2.2 </w:t>
-      </w:r>
-      <w:r>
-        <w:t>Zein da thmlabs.com-en TXT erregistroan agertzen den bandera (THM{…})?</w:t>
-      </w:r>
-    </w:p>
-    <w:p>
-      <w:r>
-        <w:t>Erantzuna: _________________________________</w:t>
-      </w:r>
-    </w:p>
-    <w:p>
-      <w:r>
-        <w:t>MX erregistroak DNS publiko batekin (Cloudflare 1.1.1.1):</w:t>
-      </w:r>
-    </w:p>
-    <w:p>
-      <w:pPr>
-        <w:spacing w:before="80" w:after="80"/>
-        <w:ind w:left="142"/>
-        <w:shd w:val="clear" w:color="auto" w:fill="F0F0F0"/>
-      </w:pPr>
-      <w:r>
-        <w:rPr>
-          <w:rFonts w:ascii="Consolas" w:hAnsi="Consolas" w:eastAsia="Consolas"/>
-          <w:color w:val="1A1A1A"/>
-          <w:sz w:val="18"/>
-        </w:rPr>
-        <w:t>nslookup -type=MX tryhackme.com 1.1.1.1</w:t>
-      </w:r>
-    </w:p>
-    <w:p>
-      <w:r>
-        <w:rPr>
-          <w:b/>
-        </w:rPr>
-        <w:t xml:space="preserve">2.3 </w:t>
-      </w:r>
-      <w:r>
-        <w:t>Aipatu gutxienez posta-zerbitzari (mail exchanger) bat:</w:t>
-      </w:r>
-    </w:p>
-    <w:p>
-      <w:r>
-        <w:t>Erantzuna: _________________________________</w:t>
-      </w:r>
-    </w:p>
-    <w:p>
-      <w:pPr>
-        <w:pStyle w:val="Heading1"/>
-      </w:pPr>
-      <w:r>
-        <w:t>3. atala – dig</w:t>
-      </w:r>
-    </w:p>
-    <w:p>
-      <w:r>
-        <w:t>dig tresna modernoa da: irteera garbia, TTL balioak eta scripting-erako egokia.</w:t>
-      </w:r>
-    </w:p>
-    <w:p>
-      <w:r>
-        <w:t>A erregistroa:</w:t>
-      </w:r>
-    </w:p>
-    <w:p>
-      <w:pPr>
-        <w:spacing w:before="80" w:after="80"/>
-        <w:ind w:left="142"/>
-        <w:shd w:val="clear" w:color="auto" w:fill="F0F0F0"/>
-      </w:pPr>
-      <w:r>
-        <w:rPr>
-          <w:rFonts w:ascii="Consolas" w:hAnsi="Consolas" w:eastAsia="Consolas"/>
-          <w:color w:val="1A1A1A"/>
-          <w:sz w:val="18"/>
-        </w:rPr>
-        <w:t>dig tryhackme.com A</w:t>
-      </w:r>
-    </w:p>
-    <w:p>
-      <w:r>
-        <w:rPr>
-          <w:b/>
-        </w:rPr>
-        <w:t xml:space="preserve">3.1 </w:t>
-      </w:r>
-      <w:r>
-        <w:t>ANSWER SECTION-en, zenbat segundo durako TTL bat ikusi duzu? (zenbakia)</w:t>
-      </w:r>
-    </w:p>
-    <w:p>
-      <w:r>
-        <w:t>Erantzuna: _________________________________</w:t>
-      </w:r>
-    </w:p>
-    <w:p>
-      <w:r>
-        <w:t>TXT (berriro, dig-ekin):</w:t>
-      </w:r>
-    </w:p>
-    <w:p>
-      <w:pPr>
-        <w:spacing w:before="80" w:after="80"/>
-        <w:ind w:left="142"/>
-        <w:shd w:val="clear" w:color="auto" w:fill="F0F0F0"/>
-      </w:pPr>
-      <w:r>
-        <w:rPr>
-          <w:rFonts w:ascii="Consolas" w:hAnsi="Consolas" w:eastAsia="Consolas"/>
-          <w:color w:val="1A1A1A"/>
-          <w:sz w:val="18"/>
-        </w:rPr>
-        <w:t>dig thmlabs.com TXT</w:t>
-      </w:r>
-    </w:p>
-    <w:p>
-      <w:r>
-        <w:rPr>
-          <w:b/>
-        </w:rPr>
-        <w:t xml:space="preserve">3.2 </w:t>
-      </w:r>
-      <w:r>
-        <w:t>Berretsi 2.2ko bandera dig-ekin. Berdina da? (Bai/Ez)</w:t>
-      </w:r>
-    </w:p>
-    <w:p>
-      <w:r>
-        <w:t>Erantzuna: _________________________________</w:t>
-      </w:r>
-    </w:p>
-    <w:p>
-      <w:r>
-        <w:t>MX Cloudflare DNS erabiliz:</w:t>
-      </w:r>
-    </w:p>
-    <w:p>
-      <w:pPr>
-        <w:spacing w:before="80" w:after="80"/>
-        <w:ind w:left="142"/>
-        <w:shd w:val="clear" w:color="auto" w:fill="F0F0F0"/>
-      </w:pPr>
-      <w:r>
-        <w:rPr>
-          <w:rFonts w:ascii="Consolas" w:hAnsi="Consolas" w:eastAsia="Consolas"/>
-          <w:color w:val="1A1A1A"/>
-          <w:sz w:val="18"/>
-        </w:rPr>
-        <w:t>dig @1.1.1.1 tryhackme.com MX</w:t>
-      </w:r>
-    </w:p>
-    <w:p>
-      <w:r>
-        <w:rPr>
-          <w:b/>
-        </w:rPr>
-        <w:t xml:space="preserve">3.3 </w:t>
-      </w:r>
-      <w:r>
-        <w:t>MX lerroetan agertzen den lehentasun (priority) zenbakietatik, zein da txikiena? Zenbaki txikiagoak lehentasun handiagoa du.</w:t>
-      </w:r>
-    </w:p>
-    <w:p>
-      <w:r>
-        <w:t>Erantzuna: _________________________________</w:t>
-      </w:r>
-    </w:p>
-    <w:p>
-      <w:pPr>
-        <w:pStyle w:val="Heading1"/>
-      </w:pPr>
-      <w:r>
-        <w:t>4. atala – Konparazio laburra</w:t>
-      </w:r>
-    </w:p>
-    <w:p>
-      <w:r>
-        <w:rPr>
-          <w:b/>
-        </w:rPr>
-        <w:t xml:space="preserve">4.1 </w:t>
-      </w:r>
-      <w:r>
-        <w:t>Zergatik jotzen dira whois / nslookup / dig kontsulta hauek ezagutze pasibotzat?</w:t>
-      </w:r>
-    </w:p>
-    <w:p>
-      <w:r>
-        <w:t>Erantzuna: _________________________________</w:t>
-      </w:r>
-    </w:p>
-    <w:p>
-      <w:r>
-        <w:t>_______________________________________________</w:t>
-      </w:r>
-    </w:p>
-    <w:p>
-      <w:r>
-        <w:rPr>
-          <w:b/>
-        </w:rPr>
-        <w:t xml:space="preserve">4.2 </w:t>
-      </w:r>
-      <w:r>
-        <w:t>nslookup eta dig artean, zein gomendatuko zenuke gaur egun eta zergatik? (labur)</w:t>
-      </w:r>
-    </w:p>
-    <w:p>
-      <w:r>
-        <w:t>Erantzuna: _________________________________</w:t>
-      </w:r>
-    </w:p>
-    <w:p>
-      <w:r>
-        <w:t>_______________________________________________</w:t>
-      </w:r>
-    </w:p>
-    <w:p>
-      <w:pPr>
-        <w:pStyle w:val="Heading1"/>
-      </w:pPr>
-      <w:r>
-        <w:t>5. atala – Erronka (aukerakoa)</w:t>
-      </w:r>
-    </w:p>
-    <w:p>
-      <w:r>
-        <w:t>Aukeratu domeinu publiko bat (adib. example.com, cloudflare.com) eta:</w:t>
+        <w:t>Luzeegia bada:</w:t>
       </w:r>
     </w:p>
     <w:p>
@@ -485,7 +263,243 @@
           <w:sz w:val="18"/>
         </w:rPr>
         <w:t>whois DOMEINUA | less</w:t>
+      </w:r>
+    </w:p>
+    <w:p>
+      <w:r>
+        <w:rPr>
+          <w:b/>
+        </w:rPr>
+        <w:t xml:space="preserve">1.1. </w:t>
+      </w:r>
+      <w:r>
+        <w:t>Creation / Registration Date (erregistro-data):</w:t>
+      </w:r>
+    </w:p>
+    <w:p>
+      <w:r>
+        <w:t>_______________________________________________</w:t>
+      </w:r>
+    </w:p>
+    <w:p>
+      <w:r>
+        <w:rPr>
+          <w:b/>
+        </w:rPr>
+        <w:t xml:space="preserve">1.2. </w:t>
+      </w:r>
+      <w:r>
+        <w:t>Registrar (erregistratzailea):</w:t>
+      </w:r>
+    </w:p>
+    <w:p>
+      <w:r>
+        <w:t>_______________________________________________</w:t>
+      </w:r>
+    </w:p>
+    <w:p>
+      <w:r>
+        <w:rPr>
+          <w:b/>
+        </w:rPr>
+        <w:t xml:space="preserve">1.3. </w:t>
+      </w:r>
+      <w:r>
+        <w:t>Name Server-ak (gutxienez bi, badaude):</w:t>
+      </w:r>
+    </w:p>
+    <w:p>
+      <w:r>
+        <w:t>_______________________________________________</w:t>
+      </w:r>
+    </w:p>
+    <w:p>
+      <w:r>
+        <w:t>_______________________________________________</w:t>
+      </w:r>
+    </w:p>
+    <w:p>
+      <w:r>
+        <w:rPr>
+          <w:b/>
+        </w:rPr>
+        <w:t xml:space="preserve">1.4. </w:t>
+      </w:r>
+      <w:r>
+        <w:t>WHOIS irteeran, zer informazio dago redaktatuta / ezkutatuta pribatutasunagatik? Ez badago ezer ezkutatuta, idatzi “ezer ez”.</w:t>
+      </w:r>
+    </w:p>
+    <w:p>
+      <w:r>
+        <w:t>_______________________________________________</w:t>
+      </w:r>
+    </w:p>
+    <w:p>
+      <w:r>
+        <w:t>_______________________________________________</w:t>
+      </w:r>
+    </w:p>
+    <w:p>
+      <w:r>
+        <w:rPr>
+          <w:b/>
+        </w:rPr>
+        <w:t xml:space="preserve">1.5. </w:t>
+      </w:r>
+      <w:r>
+        <w:t>Galderatxoa: WHOIS zerbitzariek tradizionalki zein TCP atakan entzuten dute?</w:t>
+      </w:r>
+    </w:p>
+    <w:p>
+      <w:r>
+        <w:t>_______________________________________________</w:t>
+      </w:r>
+    </w:p>
+    <w:p>
+      <w:pPr>
+        <w:pStyle w:val="Heading1"/>
+      </w:pPr>
+      <w:r>
+        <w:t>2. nslookup</w:t>
+      </w:r>
+    </w:p>
+    <w:p>
+      <w:r>
+        <w:t>nslookup-ek DNS erregistroak kontsultatzen ditu. Erabilgarria da, batez ere Windows inguruneetan eta dokumentazio zaharrean.</w:t>
+      </w:r>
+    </w:p>
+    <w:p>
+      <w:r>
+        <w:t>A (IPv4), MX eta TXT:</w:t>
+      </w:r>
+    </w:p>
+    <w:p>
+      <w:pPr>
+        <w:spacing w:before="80" w:after="80"/>
+        <w:ind w:left="142"/>
+        <w:shd w:val="clear" w:color="auto" w:fill="F0F0F0"/>
+      </w:pPr>
+      <w:r>
+        <w:rPr>
+          <w:rFonts w:ascii="Consolas" w:hAnsi="Consolas" w:eastAsia="Consolas"/>
+          <w:color w:val="1A1A1A"/>
+          <w:sz w:val="18"/>
+        </w:rPr>
+        <w:t>nslookup DOMEINUA</w:t>
         <w:br/>
+        <w:t>nslookup -type=MX DOMEINUA</w:t>
+        <w:br/>
+        <w:t>nslookup -type=TXT DOMEINUA</w:t>
+        <w:br/>
+        <w:t># Aukerakoa: DNS zerbitzari publikoa zehaztu</w:t>
+        <w:br/>
+        <w:t>nslookup -type=MX DOMEINUA 1.1.1.1</w:t>
+      </w:r>
+    </w:p>
+    <w:p>
+      <w:r>
+        <w:rPr>
+          <w:b/>
+        </w:rPr>
+        <w:t xml:space="preserve">2.1. </w:t>
+      </w:r>
+      <w:r>
+        <w:t>A erregistroa: lortutako IPv4 helbidea(k):</w:t>
+      </w:r>
+    </w:p>
+    <w:p>
+      <w:r>
+        <w:t>_______________________________________________</w:t>
+      </w:r>
+    </w:p>
+    <w:p>
+      <w:r>
+        <w:t>_______________________________________________</w:t>
+      </w:r>
+    </w:p>
+    <w:p>
+      <w:r>
+        <w:rPr>
+          <w:b/>
+        </w:rPr>
+        <w:t xml:space="preserve">2.2. </w:t>
+      </w:r>
+      <w:r>
+        <w:t>MX: posta-zerbitzariak eta priority balioak (badaude):</w:t>
+      </w:r>
+    </w:p>
+    <w:p>
+      <w:r>
+        <w:t>_______________________________________________</w:t>
+      </w:r>
+    </w:p>
+    <w:p>
+      <w:r>
+        <w:t>_______________________________________________</w:t>
+      </w:r>
+    </w:p>
+    <w:p>
+      <w:r>
+        <w:rPr>
+          <w:b/>
+        </w:rPr>
+        <w:t xml:space="preserve">2.3. </w:t>
+      </w:r>
+      <w:r>
+        <w:t>TXT: aipatu aurkitutako sarrera interesgarri bat (edo “ez dago / hutsa”):</w:t>
+      </w:r>
+    </w:p>
+    <w:p>
+      <w:r>
+        <w:t>_______________________________________________</w:t>
+      </w:r>
+    </w:p>
+    <w:p>
+      <w:r>
+        <w:t>_______________________________________________</w:t>
+      </w:r>
+    </w:p>
+    <w:p>
+      <w:r>
+        <w:rPr>
+          <w:b/>
+        </w:rPr>
+        <w:t xml:space="preserve">2.4. </w:t>
+      </w:r>
+      <w:r>
+        <w:t>Galderatxoa: nslookup -type=AAAA DOMEINUA eginez, zer motatako helbideak bilatzen dituzu?</w:t>
+      </w:r>
+    </w:p>
+    <w:p>
+      <w:r>
+        <w:t>_______________________________________________</w:t>
+      </w:r>
+    </w:p>
+    <w:p>
+      <w:pPr>
+        <w:pStyle w:val="Heading1"/>
+      </w:pPr>
+      <w:r>
+        <w:t>3. dig</w:t>
+      </w:r>
+    </w:p>
+    <w:p>
+      <w:r>
+        <w:t>dig tresna modernoa da: irteera argiagoa, TTL balioak erakusten ditu eta scripting-erako egokiagoa da.</w:t>
+      </w:r>
+    </w:p>
+    <w:p>
+      <w:pPr>
+        <w:spacing w:before="80" w:after="80"/>
+        <w:ind w:left="142"/>
+        <w:shd w:val="clear" w:color="auto" w:fill="F0F0F0"/>
+      </w:pPr>
+      <w:r>
+        <w:rPr>
+          <w:rFonts w:ascii="Consolas" w:hAnsi="Consolas" w:eastAsia="Consolas"/>
+          <w:color w:val="1A1A1A"/>
+          <w:sz w:val="18"/>
+        </w:rPr>
         <w:t>dig DOMEINUA A</w:t>
         <w:br/>
         <w:t>dig DOMEINUA MX</w:t>
@@ -493,26 +507,226 @@
         <w:t>dig DOMEINUA TXT</w:t>
         <w:br/>
         <w:t>dig DOMEINUA NS</w:t>
+        <w:br/>
+        <w:t># DNS zerbitzari zehatza:</w:t>
+        <w:br/>
+        <w:t>dig @1.1.1.1 DOMEINUA MX</w:t>
       </w:r>
     </w:p>
     <w:p>
       <w:r>
-        <w:t>Idatzi 3 datu interesgarri (erregistratzailea, NS, MX, TXT…):</w:t>
+        <w:rPr>
+          <w:b/>
+        </w:rPr>
+        <w:t xml:space="preserve">3.1. </w:t>
+      </w:r>
+      <w:r>
+        <w:t>A erregistroaren TTL balioa (ANSWER SECTION-eko segundoak):</w:t>
       </w:r>
     </w:p>
     <w:p>
       <w:r>
-        <w:t>1. _________________________________</w:t>
+        <w:t>_______________________________________________</w:t>
       </w:r>
     </w:p>
     <w:p>
       <w:r>
-        <w:t>2. _________________________________</w:t>
+        <w:rPr>
+          <w:b/>
+        </w:rPr>
+        <w:t xml:space="preserve">3.2. </w:t>
+      </w:r>
+      <w:r>
+        <w:t>NS erregistroak (name-zerbitzariak dig-ekin):</w:t>
       </w:r>
     </w:p>
     <w:p>
       <w:r>
-        <w:t>3. _________________________________</w:t>
+        <w:t>_______________________________________________</w:t>
+      </w:r>
+    </w:p>
+    <w:p>
+      <w:r>
+        <w:t>_______________________________________________</w:t>
+      </w:r>
+    </w:p>
+    <w:p>
+      <w:r>
+        <w:rPr>
+          <w:b/>
+        </w:rPr>
+        <w:t xml:space="preserve">3.3. </w:t>
+      </w:r>
+      <w:r>
+        <w:t>nslookup-ekin lortutako A / MX emaitzak dig-ekin bat datoz? Azaldu labur desberdintasunik badago (irteeraren formatua, TTL…).</w:t>
+      </w:r>
+    </w:p>
+    <w:p>
+      <w:r>
+        <w:t>_______________________________________________</w:t>
+      </w:r>
+    </w:p>
+    <w:p>
+      <w:r>
+        <w:t>_______________________________________________</w:t>
+      </w:r>
+    </w:p>
+    <w:p>
+      <w:r>
+        <w:rPr>
+          <w:b/>
+        </w:rPr>
+        <w:t xml:space="preserve">3.4. </w:t>
+      </w:r>
+      <w:r>
+        <w:t>Galderatxoa: dig @8.8.8.8 DOMEINUA A komandoan, zer adierazten du @8.8.8.8 zatiak?</w:t>
+      </w:r>
+    </w:p>
+    <w:p>
+      <w:r>
+        <w:t>_______________________________________________</w:t>
+      </w:r>
+    </w:p>
+    <w:p>
+      <w:pPr>
+        <w:pStyle w:val="Heading1"/>
+      </w:pPr>
+      <w:r>
+        <w:t>4. Hiru tresnen inguruko galderatxoak</w:t>
+      </w:r>
+    </w:p>
+    <w:p>
+      <w:r>
+        <w:rPr>
+          <w:b/>
+        </w:rPr>
+        <w:t xml:space="preserve">4.1. </w:t>
+      </w:r>
+      <w:r>
+        <w:t>Zergatik jotzen dira whois, nslookup eta dig kontsulta hauek ezagutze pasibotzat?</w:t>
+      </w:r>
+    </w:p>
+    <w:p>
+      <w:r>
+        <w:t>_______________________________________________</w:t>
+      </w:r>
+    </w:p>
+    <w:p>
+      <w:r>
+        <w:t>_______________________________________________</w:t>
+      </w:r>
+    </w:p>
+    <w:p>
+      <w:r>
+        <w:rPr>
+          <w:b/>
+        </w:rPr>
+        <w:t xml:space="preserve">4.2. </w:t>
+      </w:r>
+      <w:r>
+        <w:t>Zein tresnak ematen ditu domeinuaren erregistro-datuak (data, registrar…), eta zeinek DNS erregistroak (A, MX, TXT…)?</w:t>
+      </w:r>
+    </w:p>
+    <w:p>
+      <w:r>
+        <w:t>_______________________________________________</w:t>
+      </w:r>
+    </w:p>
+    <w:p>
+      <w:r>
+        <w:t>_______________________________________________</w:t>
+      </w:r>
+    </w:p>
+    <w:p>
+      <w:r>
+        <w:rPr>
+          <w:b/>
+        </w:rPr>
+        <w:t xml:space="preserve">4.3. </w:t>
+      </w:r>
+      <w:r>
+        <w:t>nslookup eta dig artean, zein gomendatuko zenuke gaur egun eta zergatik?</w:t>
+      </w:r>
+    </w:p>
+    <w:p>
+      <w:r>
+        <w:t>_______________________________________________</w:t>
+      </w:r>
+    </w:p>
+    <w:p>
+      <w:r>
+        <w:t>_______________________________________________</w:t>
+      </w:r>
+    </w:p>
+    <w:p>
+      <w:r>
+        <w:rPr>
+          <w:b/>
+        </w:rPr>
+        <w:t xml:space="preserve">4.4. </w:t>
+      </w:r>
+      <w:r>
+        <w:t>Adibide bat: zer litzateke ezagutze AKTIBOA egoera berean? (ez egin; azaldu soilik)</w:t>
+      </w:r>
+    </w:p>
+    <w:p>
+      <w:r>
+        <w:t>_______________________________________________</w:t>
+      </w:r>
+    </w:p>
+    <w:p>
+      <w:r>
+        <w:t>_______________________________________________</w:t>
+      </w:r>
+    </w:p>
+    <w:p>
+      <w:pPr>
+        <w:pStyle w:val="Heading1"/>
+      </w:pPr>
+      <w:r>
+        <w:t>5. Ondorioa</w:t>
+      </w:r>
+    </w:p>
+    <w:p>
+      <w:r>
+        <w:t>Idatzi 4–6 esalditan: zer aurkitu duzun zure domeinuari buruz, zer tresna izan den erabilgarriena zuretzat, eta zer kontuz ibili behar den informazio publikoa bilatzean.</w:t>
+      </w:r>
+    </w:p>
+    <w:p>
+      <w:r>
+        <w:t>_______________________________________________</w:t>
+      </w:r>
+    </w:p>
+    <w:p>
+      <w:r>
+        <w:t>_______________________________________________</w:t>
+      </w:r>
+    </w:p>
+    <w:p>
+      <w:r>
+        <w:t>_______________________________________________</w:t>
+      </w:r>
+    </w:p>
+    <w:p>
+      <w:r>
+        <w:t>_______________________________________________</w:t>
+      </w:r>
+    </w:p>
+    <w:p>
+      <w:r>
+        <w:t>_______________________________________________</w:t>
+      </w:r>
+    </w:p>
+    <w:p/>
+    <w:p>
+      <w:r>
+        <w:rPr>
+          <w:b/>
+        </w:rPr>
+        <w:t xml:space="preserve">Ebaluazio-iradokizuna (irakaslea): </w:t>
+      </w:r>
+      <w:r>
+        <w:t>domeinu propioa · hiru tresnak erabili · komandoak + irteerak · galderak erantzunda · ondorioa.</w:t>
       </w:r>
     </w:p>
     <w:p>
@@ -526,24 +740,12 @@
         <w:jc w:val="center"/>
       </w:pPr>
       <w:r>
-        <w:t>Irtenbideak (irakaslearentzat)</w:t>
+        <w:t>Irakaslearen gida (ez banatu ikasleekin)</w:t>
       </w:r>
     </w:p>
     <w:p>
       <w:r>
-        <w:t>Oharra: WHOIS/DNS datu batzuk denboran alda daitezke (IP, TTL, MX). Bandera eta kontzeptuak egonkorragoak dira.</w:t>
-      </w:r>
-    </w:p>
-    <w:p/>
-    <w:p>
-      <w:r>
-        <w:rPr>
-          <w:b/>
-        </w:rPr>
-        <w:t xml:space="preserve">1.1. </w:t>
-      </w:r>
-      <w:r>
-        <w:t>2018-07-05 (Creation Date; TryHackMe room-ean 20180705 gisa ere onartzen da).</w:t>
+        <w:t>Ikasle bakoitzak (edo taldeak) domeinu desberdina aukeratuko du; erantzun faktikoak (IP, TTL, registrar…) ez dira bakarrak. Egiaztatu prozesua eta ulermena.</w:t>
       </w:r>
     </w:p>
     <w:p>
@@ -551,10 +753,10 @@
         <w:rPr>
           <w:b/>
         </w:rPr>
-        <w:t xml:space="preserve">1.2. </w:t>
+        <w:t xml:space="preserve">1.5. </w:t>
       </w:r>
       <w:r>
-        <w:t>Namecheap / NAMECHEAP INC (namecheap.com).</w:t>
+        <w:t>43 (TCP).</w:t>
       </w:r>
     </w:p>
     <w:p>
@@ -562,10 +764,10 @@
         <w:rPr>
           <w:b/>
         </w:rPr>
-        <w:t xml:space="preserve">1.3. </w:t>
+        <w:t xml:space="preserve">2.4. </w:t>
       </w:r>
       <w:r>
-        <w:t>Cloudflare (ns*.cloudflare.com).</w:t>
+        <w:t>IPv6 helbideak (AAAA erregistroak).</w:t>
       </w:r>
     </w:p>
     <w:p>
@@ -573,65 +775,10 @@
         <w:rPr>
           <w:b/>
         </w:rPr>
-        <w:t xml:space="preserve">2.1. </w:t>
+        <w:t xml:space="preserve">3.4. </w:t>
       </w:r>
       <w:r>
-        <w:t>Cloudflare-ren IPv4 bat (adib. 104.26.x.x / 172.67.x.x). IP zehatzak alda daitezke.</w:t>
-      </w:r>
-    </w:p>
-    <w:p>
-      <w:r>
-        <w:rPr>
-          <w:b/>
-        </w:rPr>
-        <w:t xml:space="preserve">2.2. </w:t>
-      </w:r>
-      <w:r>
-        <w:t>THM{a5b83929888ed36acb0272971e438d78}</w:t>
-      </w:r>
-    </w:p>
-    <w:p>
-      <w:r>
-        <w:rPr>
-          <w:b/>
-        </w:rPr>
-        <w:t xml:space="preserve">2.3. </w:t>
-      </w:r>
-      <w:r>
-        <w:t>Google-ren MX bat, adib. aspmx.l.google.com edo alt1.aspmx.l.google.com.</w:t>
-      </w:r>
-    </w:p>
-    <w:p>
-      <w:r>
-        <w:rPr>
-          <w:b/>
-        </w:rPr>
-        <w:t xml:space="preserve">3.1. </w:t>
-      </w:r>
-      <w:r>
-        <w:t>TTL zenbakia ANSWER SECTION-eko bigarren zutabean (adib. 300). Balioa alda daiteke.</w:t>
-      </w:r>
-    </w:p>
-    <w:p>
-      <w:r>
-        <w:rPr>
-          <w:b/>
-        </w:rPr>
-        <w:t xml:space="preserve">3.2. </w:t>
-      </w:r>
-      <w:r>
-        <w:t>Bai – TXT berdina izan behar du.</w:t>
-      </w:r>
-    </w:p>
-    <w:p>
-      <w:r>
-        <w:rPr>
-          <w:b/>
-        </w:rPr>
-        <w:t xml:space="preserve">3.3. </w:t>
-      </w:r>
-      <w:r>
-        <w:t>Lehentasun txikiena (normalean 10 tryhackme.com-en MX zerrendan). Egiaztatu irteeran.</w:t>
+        <w:t>Kontsulta 8.8.8.8 DNS zerbitzariari (Google DNS) bidaltzen zaiola.</w:t>
       </w:r>
     </w:p>
     <w:p>
@@ -642,7 +789,7 @@
         <w:t xml:space="preserve">4.1. </w:t>
       </w:r>
       <w:r>
-        <w:t>Informazio publikoa kontsultatzen da (WHOIS/DNS zerbitzari irekiak); ez zaio paketerik bidaltzen helburuko ostalariari zuzenean.</w:t>
+        <w:t>Iturri publikoak kontsultatzen dira; ez zaio paketerik bidaltzen helburuko ostalariari zuzenean.</w:t>
       </w:r>
     </w:p>
     <w:p>
@@ -653,7 +800,7 @@
         <w:t xml:space="preserve">4.2. </w:t>
       </w:r>
       <w:r>
-        <w:t>dig: irteera argiagoa, TTL erakusten du, scripting-erako hobea. nslookup bateragarritasunerako erabilgarria da.</w:t>
+        <w:t>WHOIS → erregistro-datuak. nslookup eta dig → DNS erregistroak.</w:t>
       </w:r>
     </w:p>
     <w:p>
@@ -661,10 +808,21 @@
         <w:rPr>
           <w:b/>
         </w:rPr>
-        <w:t xml:space="preserve">5. </w:t>
+        <w:t xml:space="preserve">4.3. </w:t>
       </w:r>
       <w:r>
-        <w:t>Ikaslearen arabera. Egiaztatu komandoen irteera koherentea den.</w:t>
+        <w:t>dig: irteera argiagoa, TTL, scripting. nslookup: bateragarritasuna.</w:t>
+      </w:r>
+    </w:p>
+    <w:p>
+      <w:r>
+        <w:rPr>
+          <w:b/>
+        </w:rPr>
+        <w:t xml:space="preserve">4.4. </w:t>
+      </w:r>
+      <w:r>
+        <w:t>Adib.: nmap, ping, direktorio-brute force, helburuarekin interakzio zuzena…</w:t>
       </w:r>
     </w:p>
     <w:sectPr>

</xml_diff>

<commit_message>
Jardueran hosting/zerbitzari mota bilatzeko atala gehitu
Ikasleek interneten bilatu behar dute shared, VPS, dedicated edo
cloud/CDN motarik den, iturria aipatuz.

Co-authored-by: jazkune-izarraitz <jazkune-izarraitz@users.noreply.github.com>
</commit_message>
<xml_diff>
--- a/testak/Ezagutze_pasiboa_jarduera_praktikoa.docx
+++ b/testak/Ezagutze_pasiboa_jarduera_praktikoa.docx
@@ -19,7 +19,7 @@
         <w:rPr>
           <w:i/>
         </w:rPr>
-        <w:t>whois · nslookup · dig</w:t>
+        <w:t>whois · nslookup · dig · hosting mota (interneten bilatu)</w:t>
         <w:br/>
         <w:t>Ikasleak aukeratutako domeinu batekin</w:t>
       </w:r>
@@ -80,6 +80,14 @@
       </w:pPr>
       <w:r>
         <w:t>Beheko galderen erantzunak.</w:t>
+      </w:r>
+    </w:p>
+    <w:p>
+      <w:pPr>
+        <w:pStyle w:val="ListNumber"/>
+      </w:pPr>
+      <w:r>
+        <w:t>Hosting / zerbitzari motari buruzko bilaketa (interneteko iturriak aipatuz).</w:t>
       </w:r>
     </w:p>
     <w:p>
@@ -592,7 +600,54 @@
         <w:pStyle w:val="Heading1"/>
       </w:pPr>
       <w:r>
-        <w:t>4. Hiru tresnen inguruko galderatxoak</w:t>
+        <w:t>4. Zerbitzari / hosting mota (interneten bilatu)</w:t>
+      </w:r>
+    </w:p>
+    <w:p>
+      <w:r>
+        <w:t>Webguneak hosting mota desberdinetan egon daitezke, adibidez:</w:t>
+      </w:r>
+    </w:p>
+    <w:p>
+      <w:pPr>
+        <w:pStyle w:val="ListBullet"/>
+      </w:pPr>
+      <w:r>
+        <w:t>Shared hosting (ostatze partekatua) – makina bera bezero askoren artean.</w:t>
+      </w:r>
+    </w:p>
+    <w:p>
+      <w:pPr>
+        <w:pStyle w:val="ListBullet"/>
+      </w:pPr>
+      <w:r>
+        <w:t>VPS (Virtual Private Server) – makina birtuala, baliabide propioagoak.</w:t>
+      </w:r>
+    </w:p>
+    <w:p>
+      <w:pPr>
+        <w:pStyle w:val="ListBullet"/>
+      </w:pPr>
+      <w:r>
+        <w:t>Dedicated – zerbitzari fisiko osoa bezero bakar batentzat.</w:t>
+      </w:r>
+    </w:p>
+    <w:p>
+      <w:pPr>
+        <w:pStyle w:val="ListBullet"/>
+      </w:pPr>
+      <w:r>
+        <w:t>Cloud / CDN – hodeiko azpiegitura edo edukia banatzeko sarea (adib. Cloudflare, AWS, Azure…).</w:t>
+      </w:r>
+    </w:p>
+    <w:p>
+      <w:r>
+        <w:t>Zure domeinuari buruzko pistak erabili (WHOIS-eko registrar, name-zerbitzariak, IP-aren jabea…) eta bilatu Interneten hosting / zerbitzari mota. Adibideak: hosting-en dokumentazioa, “who hosts”, IP/ASN bilatzaileak, enpresaren “about / hosting” orriak. Aipatu erabilitako iturria.</w:t>
+      </w:r>
+    </w:p>
+    <w:p>
+      <w:r>
+        <w:t>Oharra: batzuetan ez da %100 ziurra; azaldu zure hipotesia eta zertan oinarritu zaren.</w:t>
       </w:r>
     </w:p>
     <w:p>
@@ -601,6 +656,93 @@
           <w:b/>
         </w:rPr>
         <w:t xml:space="preserve">4.1. </w:t>
+      </w:r>
+      <w:r>
+        <w:t>Zure ustez, zer motatako hosting / zerbitzaria da? (shared, VPS, dedicated, cloud/CDN, beste…)</w:t>
+      </w:r>
+    </w:p>
+    <w:p>
+      <w:r>
+        <w:t>_______________________________________________</w:t>
+      </w:r>
+    </w:p>
+    <w:p>
+      <w:r>
+        <w:rPr>
+          <w:b/>
+        </w:rPr>
+        <w:t xml:space="preserve">4.2. </w:t>
+      </w:r>
+      <w:r>
+        <w:t>Zertan oinarritu zara? (NS izenak, IP/hornitzailea, web bilaketa…)</w:t>
+      </w:r>
+    </w:p>
+    <w:p>
+      <w:r>
+        <w:t>_______________________________________________</w:t>
+      </w:r>
+    </w:p>
+    <w:p>
+      <w:r>
+        <w:t>_______________________________________________</w:t>
+      </w:r>
+    </w:p>
+    <w:p>
+      <w:r>
+        <w:rPr>
+          <w:b/>
+        </w:rPr>
+        <w:t xml:space="preserve">4.3. </w:t>
+      </w:r>
+      <w:r>
+        <w:t>Erabilitako Interneteko iturria(k) (URL edo tresnaren izena):</w:t>
+      </w:r>
+    </w:p>
+    <w:p>
+      <w:r>
+        <w:t>_______________________________________________</w:t>
+      </w:r>
+    </w:p>
+    <w:p>
+      <w:r>
+        <w:t>_______________________________________________</w:t>
+      </w:r>
+    </w:p>
+    <w:p>
+      <w:r>
+        <w:rPr>
+          <w:b/>
+        </w:rPr>
+        <w:t xml:space="preserve">4.4. </w:t>
+      </w:r>
+      <w:r>
+        <w:t>Galderatxoa: shared hosting batean, zergatik izan daiteke arriskutsuagoa edo interesgarriagoa erasotzaile batentzat (ideiaz, labur)?</w:t>
+      </w:r>
+    </w:p>
+    <w:p>
+      <w:r>
+        <w:t>_______________________________________________</w:t>
+      </w:r>
+    </w:p>
+    <w:p>
+      <w:r>
+        <w:t>_______________________________________________</w:t>
+      </w:r>
+    </w:p>
+    <w:p>
+      <w:pPr>
+        <w:pStyle w:val="Heading1"/>
+      </w:pPr>
+      <w:r>
+        <w:t>5. Hiru tresnen inguruko galderatxoak</w:t>
+      </w:r>
+    </w:p>
+    <w:p>
+      <w:r>
+        <w:rPr>
+          <w:b/>
+        </w:rPr>
+        <w:t xml:space="preserve">5.1. </w:t>
       </w:r>
       <w:r>
         <w:t>Zergatik jotzen dira whois, nslookup eta dig kontsulta hauek ezagutze pasibotzat?</w:t>
@@ -621,7 +763,7 @@
         <w:rPr>
           <w:b/>
         </w:rPr>
-        <w:t xml:space="preserve">4.2. </w:t>
+        <w:t xml:space="preserve">5.2. </w:t>
       </w:r>
       <w:r>
         <w:t>Zein tresnak ematen ditu domeinuaren erregistro-datuak (data, registrar…), eta zeinek DNS erregistroak (A, MX, TXT…)?</w:t>
@@ -642,7 +784,7 @@
         <w:rPr>
           <w:b/>
         </w:rPr>
-        <w:t xml:space="preserve">4.3. </w:t>
+        <w:t xml:space="preserve">5.3. </w:t>
       </w:r>
       <w:r>
         <w:t>nslookup eta dig artean, zein gomendatuko zenuke gaur egun eta zergatik?</w:t>
@@ -663,7 +805,7 @@
         <w:rPr>
           <w:b/>
         </w:rPr>
-        <w:t xml:space="preserve">4.4. </w:t>
+        <w:t xml:space="preserve">5.4. </w:t>
       </w:r>
       <w:r>
         <w:t>Adibide bat: zer litzateke ezagutze AKTIBOA egoera berean? (ez egin; azaldu soilik)</w:t>
@@ -684,12 +826,12 @@
         <w:pStyle w:val="Heading1"/>
       </w:pPr>
       <w:r>
-        <w:t>5. Ondorioa</w:t>
+        <w:t>6. Ondorioa</w:t>
       </w:r>
     </w:p>
     <w:p>
       <w:r>
-        <w:t>Idatzi 4–6 esalditan: zer aurkitu duzun zure domeinuari buruz, zer tresna izan den erabilgarriena zuretzat, eta zer kontuz ibili behar den informazio publikoa bilatzean.</w:t>
+        <w:t>Idatzi 4–6 esalditan: zer aurkitu duzun zure domeinuari buruz (tresnak + hosting mota), zer izan den erabilgarriena, eta zer kontuz ibili behar den informazio publikoa bilatzean.</w:t>
       </w:r>
     </w:p>
     <w:p>
@@ -726,7 +868,7 @@
         <w:t xml:space="preserve">Ebaluazio-iradokizuna (irakaslea): </w:t>
       </w:r>
       <w:r>
-        <w:t>domeinu propioa · hiru tresnak erabili · komandoak + irteerak · galderak erantzunda · ondorioa.</w:t>
+        <w:t>domeinu propioa · hiru tresnak · hosting mota + iturria · komandoak + irteerak · galderak · ondorioa.</w:t>
       </w:r>
     </w:p>
     <w:p>
@@ -786,7 +928,29 @@
         <w:rPr>
           <w:b/>
         </w:rPr>
-        <w:t xml:space="preserve">4.1. </w:t>
+        <w:t xml:space="preserve">4.1–4.3. </w:t>
+      </w:r>
+      <w:r>
+        <w:t>Ikaslearen arabera (shared / VPS / dedicated / cloud-CDN…). Egiaztatu hipotesia + iturria aipatu dituen. Cloudflare NS = CDN/proxy pista ohikoa; ez nahastu “registrar” eta “hosting”.</w:t>
+      </w:r>
+    </w:p>
+    <w:p>
+      <w:r>
+        <w:rPr>
+          <w:b/>
+        </w:rPr>
+        <w:t xml:space="preserve">4.4. </w:t>
+      </w:r>
+      <w:r>
+        <w:t>Baliabideak partekatzen dira: auzoko bezero baten ahultasunak eragina izan dezake; gainera, askotan konfigurazio eta isolamendu ahulagoa.</w:t>
+      </w:r>
+    </w:p>
+    <w:p>
+      <w:r>
+        <w:rPr>
+          <w:b/>
+        </w:rPr>
+        <w:t xml:space="preserve">5.1. </w:t>
       </w:r>
       <w:r>
         <w:t>Iturri publikoak kontsultatzen dira; ez zaio paketerik bidaltzen helburuko ostalariari zuzenean.</w:t>
@@ -797,7 +961,7 @@
         <w:rPr>
           <w:b/>
         </w:rPr>
-        <w:t xml:space="preserve">4.2. </w:t>
+        <w:t xml:space="preserve">5.2. </w:t>
       </w:r>
       <w:r>
         <w:t>WHOIS → erregistro-datuak. nslookup eta dig → DNS erregistroak.</w:t>
@@ -808,7 +972,7 @@
         <w:rPr>
           <w:b/>
         </w:rPr>
-        <w:t xml:space="preserve">4.3. </w:t>
+        <w:t xml:space="preserve">5.3. </w:t>
       </w:r>
       <w:r>
         <w:t>dig: irteera argiagoa, TTL, scripting. nslookup: bateragarritasuna.</w:t>
@@ -819,7 +983,7 @@
         <w:rPr>
           <w:b/>
         </w:rPr>
-        <w:t xml:space="preserve">4.4. </w:t>
+        <w:t xml:space="preserve">5.4. </w:t>
       </w:r>
       <w:r>
         <w:t>Adib.: nmap, ping, direktorio-brute force, helburuarekin interakzio zuzena…</w:t>

</xml_diff>

<commit_message>
Reverse IP bilaketa gehitu jarduerara
Ikasleek hosting-aren IP berean dauden beste domeinuak bilatu
dezaten (shared vs CDN oharrak barne).

Co-authored-by: jazkune-izarraitz <jazkune-izarraitz@users.noreply.github.com>
</commit_message>
<xml_diff>
--- a/testak/Ezagutze_pasiboa_jarduera_praktikoa.docx
+++ b/testak/Ezagutze_pasiboa_jarduera_praktikoa.docx
@@ -730,6 +730,156 @@
       </w:r>
     </w:p>
     <w:p>
+      <w:r>
+        <w:rPr>
+          <w:b/>
+        </w:rPr>
+        <w:t>Hosting berean dauden beste domeinuak (Reverse IP)</w:t>
+      </w:r>
+    </w:p>
+    <w:p>
+      <w:r>
+        <w:t>Hosting-a (batez ere shared) aurkituta, galdera hau egin daiteke: IP helbide berean beste zein domeinu daude? Horri reverse IP lookup (IP alderantzikatuko bilaketa) deritzo.</w:t>
+      </w:r>
+    </w:p>
+    <w:p>
+      <w:r>
+        <w:t>Urratsak:</w:t>
+      </w:r>
+    </w:p>
+    <w:p>
+      <w:pPr>
+        <w:pStyle w:val="ListNumber"/>
+      </w:pPr>
+      <w:r>
+        <w:t>dig edo nslookup-ekin lortu zure domeinuaren A erregistroko IP-a.</w:t>
+      </w:r>
+    </w:p>
+    <w:p>
+      <w:pPr>
+        <w:pStyle w:val="ListNumber"/>
+      </w:pPr>
+      <w:r>
+        <w:t>Interneten bilatu “reverse IP lookup” + IP hori (adib. ViewDNS, SecurityTrails, HackerTarget…).</w:t>
+      </w:r>
+    </w:p>
+    <w:p>
+      <w:pPr>
+        <w:pStyle w:val="ListNumber"/>
+      </w:pPr>
+      <w:r>
+        <w:t>Zerrendan agertzen diren beste domeinuak idatzi (gutxienez 2–3, badaude).</w:t>
+      </w:r>
+    </w:p>
+    <w:p>
+      <w:r>
+        <w:t>Kontuz:</w:t>
+      </w:r>
+    </w:p>
+    <w:p>
+      <w:pPr>
+        <w:pStyle w:val="ListBullet"/>
+      </w:pPr>
+      <w:r>
+        <w:t>Shared hosting-ean askotan webgune asko IP berean daude (ez dute zertan loturarik eduki).</w:t>
+      </w:r>
+    </w:p>
+    <w:p>
+      <w:pPr>
+        <w:pStyle w:val="ListBullet"/>
+      </w:pPr>
+      <w:r>
+        <w:t>CDN batekin (Cloudflare, etab.) IP berean milaka domeinu ager daitezke; horrek ez du esan nahi hosting “auzo” bera direnik.</w:t>
+      </w:r>
+    </w:p>
+    <w:p>
+      <w:pPr>
+        <w:pStyle w:val="ListBullet"/>
+      </w:pPr>
+      <w:r>
+        <w:t>Dedicated / VPS bakarrean, berriz, domeinu gutxi (edo bakarra) ager daiteke.</w:t>
+      </w:r>
+    </w:p>
+    <w:p>
+      <w:r>
+        <w:rPr>
+          <w:b/>
+        </w:rPr>
+        <w:t xml:space="preserve">4.5. </w:t>
+      </w:r>
+      <w:r>
+        <w:t>Zure domeinuaren IP helbidea (A erregistroa):</w:t>
+      </w:r>
+    </w:p>
+    <w:p>
+      <w:r>
+        <w:t>_______________________________________________</w:t>
+      </w:r>
+    </w:p>
+    <w:p>
+      <w:r>
+        <w:rPr>
+          <w:b/>
+        </w:rPr>
+        <w:t xml:space="preserve">4.6. </w:t>
+      </w:r>
+      <w:r>
+        <w:t>Reverse IP bilaketan, IP berean aurkitutako beste domeinuak (2–3 gutxienez, badaude; bestela azaldu zergatik gutxi dauden):</w:t>
+      </w:r>
+    </w:p>
+    <w:p>
+      <w:r>
+        <w:t>_______________________________________________</w:t>
+      </w:r>
+    </w:p>
+    <w:p>
+      <w:r>
+        <w:t>_______________________________________________</w:t>
+      </w:r>
+    </w:p>
+    <w:p>
+      <w:r>
+        <w:t>_______________________________________________</w:t>
+      </w:r>
+    </w:p>
+    <w:p>
+      <w:r>
+        <w:rPr>
+          <w:b/>
+        </w:rPr>
+        <w:t xml:space="preserve">4.7. </w:t>
+      </w:r>
+      <w:r>
+        <w:t>Erabilitako reverse IP tresna / URL:</w:t>
+      </w:r>
+    </w:p>
+    <w:p>
+      <w:r>
+        <w:t>_______________________________________________</w:t>
+      </w:r>
+    </w:p>
+    <w:p>
+      <w:r>
+        <w:rPr>
+          <w:b/>
+        </w:rPr>
+        <w:t xml:space="preserve">4.8. </w:t>
+      </w:r>
+      <w:r>
+        <w:t>Galderatxoa: zergatik ez da zuzena pentsatzea IP bereko domeinu guztiak enpresa berarenak direla?</w:t>
+      </w:r>
+    </w:p>
+    <w:p>
+      <w:r>
+        <w:t>_______________________________________________</w:t>
+      </w:r>
+    </w:p>
+    <w:p>
+      <w:r>
+        <w:t>_______________________________________________</w:t>
+      </w:r>
+    </w:p>
+    <w:p>
       <w:pPr>
         <w:pStyle w:val="Heading1"/>
       </w:pPr>

</xml_diff>